<commit_message>
Finalise the proposal: three stages, VAT-inclusive pricing
Adds a one-week pre-concept stage ahead of concept and schematic design, and
splits the agreed 2 000 ₸/m² across the three at 10/20/70 so the total the
client sees is unchanged at 55 042 640 ₸.

Pricing is now stated VAT-inclusive, with the split shown: 49 145 214.29 ₸
net and 5 897 425.71 ₸ of VAT at 12%.

Programme becomes 1 week + 1 month + 2 months, thirteen weeks in total, with
the 50/50 advance-and-delivery split now applying to each of the three
stages. The visualisation count in the concept scope rises to eleven to match
what the deck actually carries.

The clause capping revisions at two rounds per stage is removed at the
client's instruction, along with the hourly rate for further rounds.

Co-Authored-By: Claude Opus 5 <noreply@anthropic.com>
Claude-Session: https://claude.ai/code/session_01Wn326a6Y6rDm3i5rqK96ac
</commit_message>
<xml_diff>
--- a/presentations/aurora-hotel/kp/MOST_KP_Bukhtarminskaya_EP.docx
+++ b/presentations/aurora-hotel/kp/MOST_KP_Bukhtarminskaya_EP.docx
@@ -122,7 +122,7 @@
           <w:sz w:val="21"/>
           <w:szCs w:val="21"/>
         </w:rPr>
-        <w:t xml:space="preserve">на разработку концепции и эскизного проекта гостиничного комплекса</w:t>
+        <w:t xml:space="preserve">на разработку форэскиза, концепции и эскизного проекта гостиничного комплекса</w:t>
       </w:r>
     </w:p>
     <w:tbl>
@@ -424,7 +424,7 @@
                 <w:sz w:val="20"/>
                 <w:szCs w:val="20"/>
               </w:rPr>
-              <w:t xml:space="preserve">Концепция и эскизный проект</w:t>
+              <w:t xml:space="preserve">Форэскиз, концепция и эскизный проект</w:t>
             </w:r>
           </w:p>
         </w:tc>
@@ -1150,7 +1150,7 @@
                 <w:sz w:val="20"/>
                 <w:szCs w:val="20"/>
               </w:rPr>
-              <w:t xml:space="preserve">Стадия 1. Концепция</w:t>
+              <w:t xml:space="preserve">Стадия 1. Форэскиз</w:t>
             </w:r>
           </w:p>
         </w:tc>
@@ -1186,7 +1186,7 @@
                 <w:sz w:val="20"/>
                 <w:szCs w:val="20"/>
               </w:rPr>
-              <w:t xml:space="preserve">30 %</w:t>
+              <w:t xml:space="preserve">10 %</w:t>
             </w:r>
           </w:p>
         </w:tc>
@@ -1222,7 +1222,7 @@
                 <w:sz w:val="20"/>
                 <w:szCs w:val="20"/>
               </w:rPr>
-              <w:t xml:space="preserve">600</w:t>
+              <w:t xml:space="preserve">200</w:t>
             </w:r>
           </w:p>
         </w:tc>
@@ -1258,7 +1258,7 @@
                 <w:sz w:val="20"/>
                 <w:szCs w:val="20"/>
               </w:rPr>
-              <w:t xml:space="preserve">16 512 792 ₸</w:t>
+              <w:t xml:space="preserve">5 504 264 ₸</w:t>
             </w:r>
           </w:p>
         </w:tc>
@@ -1295,7 +1295,152 @@
                 <w:sz w:val="20"/>
                 <w:szCs w:val="20"/>
               </w:rPr>
-              <w:t xml:space="preserve">Стадия 2. Эскизный проект</w:t>
+              <w:t xml:space="preserve">Стадия 2. Концепция</w:t>
+            </w:r>
+          </w:p>
+        </w:tc>
+        <w:tc>
+          <w:tcPr>
+            <w:tcW w:type="dxa" w:w="1400"/>
+            <w:tcBorders>
+              <w:top w:val="none" w:color="FFFFFF" w:sz="0"/>
+              <w:left w:val="none" w:color="FFFFFF" w:sz="0"/>
+              <w:bottom w:val="single" w:color="DCDCDC" w:sz="4"/>
+              <w:right w:val="none" w:color="FFFFFF" w:sz="0"/>
+            </w:tcBorders>
+            <w:tcMar>
+              <w:top w:type="dxa" w:w="90"/>
+              <w:left w:type="dxa" w:w="120"/>
+              <w:bottom w:type="dxa" w:w="90"/>
+              <w:right w:type="dxa" w:w="120"/>
+            </w:tcMar>
+          </w:tcPr>
+          <w:p>
+            <w:pPr>
+              <w:spacing w:after="0" w:line="240"/>
+              <w:jc w:val="right"/>
+            </w:pPr>
+            <w:r>
+              <w:rPr>
+                <w:rFonts w:ascii="Arial" w:cs="Arial" w:eastAsia="Arial" w:hAnsi="Arial"/>
+                <w:b w:val="false"/>
+                <w:bCs w:val="false"/>
+                <w:i w:val="false"/>
+                <w:iCs w:val="false"/>
+                <w:color w:val="333333"/>
+                <w:sz w:val="20"/>
+                <w:szCs w:val="20"/>
+              </w:rPr>
+              <w:t xml:space="preserve">20 %</w:t>
+            </w:r>
+          </w:p>
+        </w:tc>
+        <w:tc>
+          <w:tcPr>
+            <w:tcW w:type="dxa" w:w="1500"/>
+            <w:tcBorders>
+              <w:top w:val="none" w:color="FFFFFF" w:sz="0"/>
+              <w:left w:val="none" w:color="FFFFFF" w:sz="0"/>
+              <w:bottom w:val="single" w:color="DCDCDC" w:sz="4"/>
+              <w:right w:val="none" w:color="FFFFFF" w:sz="0"/>
+            </w:tcBorders>
+            <w:tcMar>
+              <w:top w:type="dxa" w:w="90"/>
+              <w:left w:type="dxa" w:w="120"/>
+              <w:bottom w:type="dxa" w:w="90"/>
+              <w:right w:type="dxa" w:w="120"/>
+            </w:tcMar>
+          </w:tcPr>
+          <w:p>
+            <w:pPr>
+              <w:spacing w:after="0" w:line="240"/>
+              <w:jc w:val="right"/>
+            </w:pPr>
+            <w:r>
+              <w:rPr>
+                <w:rFonts w:ascii="Arial" w:cs="Arial" w:eastAsia="Arial" w:hAnsi="Arial"/>
+                <w:b w:val="false"/>
+                <w:bCs w:val="false"/>
+                <w:i w:val="false"/>
+                <w:iCs w:val="false"/>
+                <w:color w:val="333333"/>
+                <w:sz w:val="20"/>
+                <w:szCs w:val="20"/>
+              </w:rPr>
+              <w:t xml:space="preserve">400</w:t>
+            </w:r>
+          </w:p>
+        </w:tc>
+        <w:tc>
+          <w:tcPr>
+            <w:tcW w:type="dxa" w:w="1500"/>
+            <w:tcBorders>
+              <w:top w:val="none" w:color="FFFFFF" w:sz="0"/>
+              <w:left w:val="none" w:color="FFFFFF" w:sz="0"/>
+              <w:bottom w:val="single" w:color="DCDCDC" w:sz="4"/>
+              <w:right w:val="none" w:color="FFFFFF" w:sz="0"/>
+            </w:tcBorders>
+            <w:tcMar>
+              <w:top w:type="dxa" w:w="90"/>
+              <w:left w:type="dxa" w:w="120"/>
+              <w:bottom w:type="dxa" w:w="90"/>
+              <w:right w:type="dxa" w:w="120"/>
+            </w:tcMar>
+          </w:tcPr>
+          <w:p>
+            <w:pPr>
+              <w:spacing w:after="0" w:line="240"/>
+              <w:jc w:val="right"/>
+            </w:pPr>
+            <w:r>
+              <w:rPr>
+                <w:rFonts w:ascii="Arial" w:cs="Arial" w:eastAsia="Arial" w:hAnsi="Arial"/>
+                <w:b/>
+                <w:bCs/>
+                <w:i w:val="false"/>
+                <w:iCs w:val="false"/>
+                <w:color w:val="111111"/>
+                <w:sz w:val="20"/>
+                <w:szCs w:val="20"/>
+              </w:rPr>
+              <w:t xml:space="preserve">11 008 528 ₸</w:t>
+            </w:r>
+          </w:p>
+        </w:tc>
+      </w:tr>
+      <w:tr>
+        <w:tc>
+          <w:tcPr>
+            <w:tcW w:type="dxa" w:w="5239"/>
+            <w:tcBorders>
+              <w:top w:val="none" w:color="FFFFFF" w:sz="0"/>
+              <w:left w:val="none" w:color="FFFFFF" w:sz="0"/>
+              <w:bottom w:val="single" w:color="DCDCDC" w:sz="4"/>
+              <w:right w:val="none" w:color="FFFFFF" w:sz="0"/>
+            </w:tcBorders>
+            <w:tcMar>
+              <w:top w:type="dxa" w:w="90"/>
+              <w:left w:type="dxa" w:w="120"/>
+              <w:bottom w:type="dxa" w:w="90"/>
+              <w:right w:type="dxa" w:w="120"/>
+            </w:tcMar>
+          </w:tcPr>
+          <w:p>
+            <w:pPr>
+              <w:spacing w:after="0" w:line="240"/>
+            </w:pPr>
+            <w:r>
+              <w:rPr>
+                <w:rFonts w:ascii="Arial" w:cs="Arial" w:eastAsia="Arial" w:hAnsi="Arial"/>
+                <w:b w:val="false"/>
+                <w:bCs w:val="false"/>
+                <w:i w:val="false"/>
+                <w:iCs w:val="false"/>
+                <w:color w:val="111111"/>
+                <w:sz w:val="20"/>
+                <w:szCs w:val="20"/>
+              </w:rPr>
+              <w:t xml:space="preserve">Стадия 3. Эскизный проект</w:t>
             </w:r>
           </w:p>
         </w:tc>
@@ -1574,7 +1719,7 @@
           <w:sz w:val="17"/>
           <w:szCs w:val="17"/>
         </w:rPr>
-        <w:t xml:space="preserve">Стоимость указана без учёта НДС. Расчёт от площади 27 521,32 м².</w:t>
+        <w:t xml:space="preserve">Стоимость указана с учётом НДС, расчёт от площади 27 521,32 м². В том числе: сумма без НДС — 49 145 214,29 ₸, НДС 12 % — 5 897 425,71 ₸.</w:t>
       </w:r>
     </w:p>
     <w:p>
@@ -1614,7 +1759,7 @@
           <w:sz w:val="21"/>
           <w:szCs w:val="21"/>
         </w:rPr>
-        <w:t xml:space="preserve">Стадия 1. Концепция</w:t>
+        <w:t xml:space="preserve">Стадия 1. Форэскиз</w:t>
       </w:r>
     </w:p>
     <w:p>
@@ -1678,7 +1823,7 @@
           <w:sz w:val="20"/>
           <w:szCs w:val="20"/>
         </w:rPr>
-        <w:t xml:space="preserve">Посадка комплекса на участок, генеральный план, отступы от границ</w:t>
+        <w:t xml:space="preserve">Варианты посадки и объёмно-пространственного решения</w:t>
       </w:r>
     </w:p>
     <w:p>
@@ -1710,7 +1855,7 @@
           <w:sz w:val="20"/>
           <w:szCs w:val="20"/>
         </w:rPr>
-        <w:t xml:space="preserve">Объёмно-пространственное решение, этажность, силуэт</w:t>
+        <w:t xml:space="preserve">Предварительные технико-экономические показатели</w:t>
       </w:r>
     </w:p>
     <w:p>
@@ -1742,103 +1887,7 @@
           <w:sz w:val="20"/>
           <w:szCs w:val="20"/>
         </w:rPr>
-        <w:t xml:space="preserve">Технико-экономические показатели, коэффициенты застройки и использования территории</w:t>
-      </w:r>
-    </w:p>
-    <w:p>
-      <w:pPr>
-        <w:spacing w:after="55" w:line="245"/>
-        <w:ind w:left="200" w:hanging="200"/>
-      </w:pPr>
-      <w:r>
-        <w:rPr>
-          <w:rFonts w:ascii="Arial" w:cs="Arial" w:eastAsia="Arial" w:hAnsi="Arial"/>
-          <w:b w:val="false"/>
-          <w:bCs w:val="false"/>
-          <w:i w:val="false"/>
-          <w:iCs w:val="false"/>
-          <w:color w:val="FF4D23"/>
-          <w:sz w:val="20"/>
-          <w:szCs w:val="20"/>
-        </w:rPr>
-        <w:t xml:space="preserve">— </w:t>
-      </w:r>
-      <w:r>
-        <w:rPr>
-          <w:rFonts w:ascii="Arial" w:cs="Arial" w:eastAsia="Arial" w:hAnsi="Arial"/>
-          <w:b w:val="false"/>
-          <w:bCs w:val="false"/>
-          <w:i w:val="false"/>
-          <w:iCs w:val="false"/>
-          <w:color w:val="333333"/>
-          <w:sz w:val="20"/>
-          <w:szCs w:val="20"/>
-        </w:rPr>
-        <w:t xml:space="preserve">Архитектурное решение фасадов, ведомость отделочных материалов</w:t>
-      </w:r>
-    </w:p>
-    <w:p>
-      <w:pPr>
-        <w:spacing w:after="55" w:line="245"/>
-        <w:ind w:left="200" w:hanging="200"/>
-      </w:pPr>
-      <w:r>
-        <w:rPr>
-          <w:rFonts w:ascii="Arial" w:cs="Arial" w:eastAsia="Arial" w:hAnsi="Arial"/>
-          <w:b w:val="false"/>
-          <w:bCs w:val="false"/>
-          <w:i w:val="false"/>
-          <w:iCs w:val="false"/>
-          <w:color w:val="FF4D23"/>
-          <w:sz w:val="20"/>
-          <w:szCs w:val="20"/>
-        </w:rPr>
-        <w:t xml:space="preserve">— </w:t>
-      </w:r>
-      <w:r>
-        <w:rPr>
-          <w:rFonts w:ascii="Arial" w:cs="Arial" w:eastAsia="Arial" w:hAnsi="Arial"/>
-          <w:b w:val="false"/>
-          <w:bCs w:val="false"/>
-          <w:i w:val="false"/>
-          <w:iCs w:val="false"/>
-          <w:color w:val="333333"/>
-          <w:sz w:val="20"/>
-          <w:szCs w:val="20"/>
-        </w:rPr>
-        <w:t xml:space="preserve">Визуализации — 6 ракурсов (экстерьер и интерьеры общественных зон)</w:t>
-      </w:r>
-    </w:p>
-    <w:p>
-      <w:pPr>
-        <w:spacing w:after="55" w:line="245"/>
-        <w:ind w:left="200" w:hanging="200"/>
-      </w:pPr>
-      <w:r>
-        <w:rPr>
-          <w:rFonts w:ascii="Arial" w:cs="Arial" w:eastAsia="Arial" w:hAnsi="Arial"/>
-          <w:b w:val="false"/>
-          <w:bCs w:val="false"/>
-          <w:i w:val="false"/>
-          <w:iCs w:val="false"/>
-          <w:color w:val="FF4D23"/>
-          <w:sz w:val="20"/>
-          <w:szCs w:val="20"/>
-        </w:rPr>
-        <w:t xml:space="preserve">— </w:t>
-      </w:r>
-      <w:r>
-        <w:rPr>
-          <w:rFonts w:ascii="Arial" w:cs="Arial" w:eastAsia="Arial" w:hAnsi="Arial"/>
-          <w:b w:val="false"/>
-          <w:bCs w:val="false"/>
-          <w:i w:val="false"/>
-          <w:iCs w:val="false"/>
-          <w:color w:val="333333"/>
-          <w:sz w:val="20"/>
-          <w:szCs w:val="20"/>
-        </w:rPr>
-        <w:t xml:space="preserve">Комплект презентационных материалов для градостроительного совета</w:t>
+        <w:t xml:space="preserve">Выбор направления для дальнейшей проработки</w:t>
       </w:r>
     </w:p>
     <w:p>
@@ -1861,7 +1910,222 @@
           <w:sz w:val="21"/>
           <w:szCs w:val="21"/>
         </w:rPr>
-        <w:t xml:space="preserve">Стадия 2. Эскизный проект</w:t>
+        <w:t xml:space="preserve">Стадия 2. Концепция</w:t>
+      </w:r>
+    </w:p>
+    <w:p>
+      <w:pPr>
+        <w:spacing w:after="55" w:line="245"/>
+        <w:ind w:left="200" w:hanging="200"/>
+      </w:pPr>
+      <w:r>
+        <w:rPr>
+          <w:rFonts w:ascii="Arial" w:cs="Arial" w:eastAsia="Arial" w:hAnsi="Arial"/>
+          <w:b w:val="false"/>
+          <w:bCs w:val="false"/>
+          <w:i w:val="false"/>
+          <w:iCs w:val="false"/>
+          <w:color w:val="FF4D23"/>
+          <w:sz w:val="20"/>
+          <w:szCs w:val="20"/>
+        </w:rPr>
+        <w:t xml:space="preserve">— </w:t>
+      </w:r>
+      <w:r>
+        <w:rPr>
+          <w:rFonts w:ascii="Arial" w:cs="Arial" w:eastAsia="Arial" w:hAnsi="Arial"/>
+          <w:b w:val="false"/>
+          <w:bCs w:val="false"/>
+          <w:i w:val="false"/>
+          <w:iCs w:val="false"/>
+          <w:color w:val="333333"/>
+          <w:sz w:val="20"/>
+          <w:szCs w:val="20"/>
+        </w:rPr>
+        <w:t xml:space="preserve">Посадка комплекса на участок, генеральный план, отступы от границ</w:t>
+      </w:r>
+    </w:p>
+    <w:p>
+      <w:pPr>
+        <w:spacing w:after="55" w:line="245"/>
+        <w:ind w:left="200" w:hanging="200"/>
+      </w:pPr>
+      <w:r>
+        <w:rPr>
+          <w:rFonts w:ascii="Arial" w:cs="Arial" w:eastAsia="Arial" w:hAnsi="Arial"/>
+          <w:b w:val="false"/>
+          <w:bCs w:val="false"/>
+          <w:i w:val="false"/>
+          <w:iCs w:val="false"/>
+          <w:color w:val="FF4D23"/>
+          <w:sz w:val="20"/>
+          <w:szCs w:val="20"/>
+        </w:rPr>
+        <w:t xml:space="preserve">— </w:t>
+      </w:r>
+      <w:r>
+        <w:rPr>
+          <w:rFonts w:ascii="Arial" w:cs="Arial" w:eastAsia="Arial" w:hAnsi="Arial"/>
+          <w:b w:val="false"/>
+          <w:bCs w:val="false"/>
+          <w:i w:val="false"/>
+          <w:iCs w:val="false"/>
+          <w:color w:val="333333"/>
+          <w:sz w:val="20"/>
+          <w:szCs w:val="20"/>
+        </w:rPr>
+        <w:t xml:space="preserve">Объёмно-пространственное решение, этажность, силуэт</w:t>
+      </w:r>
+    </w:p>
+    <w:p>
+      <w:pPr>
+        <w:spacing w:after="55" w:line="245"/>
+        <w:ind w:left="200" w:hanging="200"/>
+      </w:pPr>
+      <w:r>
+        <w:rPr>
+          <w:rFonts w:ascii="Arial" w:cs="Arial" w:eastAsia="Arial" w:hAnsi="Arial"/>
+          <w:b w:val="false"/>
+          <w:bCs w:val="false"/>
+          <w:i w:val="false"/>
+          <w:iCs w:val="false"/>
+          <w:color w:val="FF4D23"/>
+          <w:sz w:val="20"/>
+          <w:szCs w:val="20"/>
+        </w:rPr>
+        <w:t xml:space="preserve">— </w:t>
+      </w:r>
+      <w:r>
+        <w:rPr>
+          <w:rFonts w:ascii="Arial" w:cs="Arial" w:eastAsia="Arial" w:hAnsi="Arial"/>
+          <w:b w:val="false"/>
+          <w:bCs w:val="false"/>
+          <w:i w:val="false"/>
+          <w:iCs w:val="false"/>
+          <w:color w:val="333333"/>
+          <w:sz w:val="20"/>
+          <w:szCs w:val="20"/>
+        </w:rPr>
+        <w:t xml:space="preserve">Технико-экономические показатели, коэффициенты застройки и использования территории</w:t>
+      </w:r>
+    </w:p>
+    <w:p>
+      <w:pPr>
+        <w:spacing w:after="55" w:line="245"/>
+        <w:ind w:left="200" w:hanging="200"/>
+      </w:pPr>
+      <w:r>
+        <w:rPr>
+          <w:rFonts w:ascii="Arial" w:cs="Arial" w:eastAsia="Arial" w:hAnsi="Arial"/>
+          <w:b w:val="false"/>
+          <w:bCs w:val="false"/>
+          <w:i w:val="false"/>
+          <w:iCs w:val="false"/>
+          <w:color w:val="FF4D23"/>
+          <w:sz w:val="20"/>
+          <w:szCs w:val="20"/>
+        </w:rPr>
+        <w:t xml:space="preserve">— </w:t>
+      </w:r>
+      <w:r>
+        <w:rPr>
+          <w:rFonts w:ascii="Arial" w:cs="Arial" w:eastAsia="Arial" w:hAnsi="Arial"/>
+          <w:b w:val="false"/>
+          <w:bCs w:val="false"/>
+          <w:i w:val="false"/>
+          <w:iCs w:val="false"/>
+          <w:color w:val="333333"/>
+          <w:sz w:val="20"/>
+          <w:szCs w:val="20"/>
+        </w:rPr>
+        <w:t xml:space="preserve">Архитектурное решение фасадов, ведомость отделочных материалов</w:t>
+      </w:r>
+    </w:p>
+    <w:p>
+      <w:pPr>
+        <w:spacing w:after="55" w:line="245"/>
+        <w:ind w:left="200" w:hanging="200"/>
+      </w:pPr>
+      <w:r>
+        <w:rPr>
+          <w:rFonts w:ascii="Arial" w:cs="Arial" w:eastAsia="Arial" w:hAnsi="Arial"/>
+          <w:b w:val="false"/>
+          <w:bCs w:val="false"/>
+          <w:i w:val="false"/>
+          <w:iCs w:val="false"/>
+          <w:color w:val="FF4D23"/>
+          <w:sz w:val="20"/>
+          <w:szCs w:val="20"/>
+        </w:rPr>
+        <w:t xml:space="preserve">— </w:t>
+      </w:r>
+      <w:r>
+        <w:rPr>
+          <w:rFonts w:ascii="Arial" w:cs="Arial" w:eastAsia="Arial" w:hAnsi="Arial"/>
+          <w:b w:val="false"/>
+          <w:bCs w:val="false"/>
+          <w:i w:val="false"/>
+          <w:iCs w:val="false"/>
+          <w:color w:val="333333"/>
+          <w:sz w:val="20"/>
+          <w:szCs w:val="20"/>
+        </w:rPr>
+        <w:t xml:space="preserve">Визуализации — 11 ракурсов (экстерьер, интерьеры общественных зон и номера)</w:t>
+      </w:r>
+    </w:p>
+    <w:p>
+      <w:pPr>
+        <w:spacing w:after="55" w:line="245"/>
+        <w:ind w:left="200" w:hanging="200"/>
+      </w:pPr>
+      <w:r>
+        <w:rPr>
+          <w:rFonts w:ascii="Arial" w:cs="Arial" w:eastAsia="Arial" w:hAnsi="Arial"/>
+          <w:b w:val="false"/>
+          <w:bCs w:val="false"/>
+          <w:i w:val="false"/>
+          <w:iCs w:val="false"/>
+          <w:color w:val="FF4D23"/>
+          <w:sz w:val="20"/>
+          <w:szCs w:val="20"/>
+        </w:rPr>
+        <w:t xml:space="preserve">— </w:t>
+      </w:r>
+      <w:r>
+        <w:rPr>
+          <w:rFonts w:ascii="Arial" w:cs="Arial" w:eastAsia="Arial" w:hAnsi="Arial"/>
+          <w:b w:val="false"/>
+          <w:bCs w:val="false"/>
+          <w:i w:val="false"/>
+          <w:iCs w:val="false"/>
+          <w:color w:val="333333"/>
+          <w:sz w:val="20"/>
+          <w:szCs w:val="20"/>
+        </w:rPr>
+        <w:t xml:space="preserve">Комплект презентационных материалов для градостроительного совета</w:t>
+      </w:r>
+    </w:p>
+    <w:p>
+      <w:pPr>
+        <w:spacing w:after="180"/>
+      </w:pPr>
+    </w:p>
+    <w:p>
+      <w:pPr>
+        <w:spacing w:after="120" w:before="0" w:line="260"/>
+      </w:pPr>
+      <w:r>
+        <w:rPr>
+          <w:rFonts w:ascii="Arial" w:cs="Arial" w:eastAsia="Arial" w:hAnsi="Arial"/>
+          <w:b/>
+          <w:bCs/>
+          <w:i w:val="false"/>
+          <w:iCs w:val="false"/>
+          <w:color w:val="111111"/>
+          <w:sz w:val="21"/>
+          <w:szCs w:val="21"/>
+        </w:rPr>
+        <w:t xml:space="preserve">Стадия 3. Эскизный проект</w:t>
       </w:r>
     </w:p>
     <w:p>
@@ -2158,7 +2422,7 @@
                 <w:sz w:val="20"/>
                 <w:szCs w:val="20"/>
               </w:rPr>
-              <w:t xml:space="preserve">Стадия 1. Концепция</w:t>
+              <w:t xml:space="preserve">Стадия 1. Форэскиз</w:t>
             </w:r>
           </w:p>
         </w:tc>
@@ -2194,7 +2458,7 @@
                 <w:sz w:val="20"/>
                 <w:szCs w:val="20"/>
               </w:rPr>
-              <w:t xml:space="preserve">3 недели</w:t>
+              <w:t xml:space="preserve">1 неделя</w:t>
             </w:r>
           </w:p>
         </w:tc>
@@ -2231,7 +2495,7 @@
                 <w:sz w:val="20"/>
                 <w:szCs w:val="20"/>
               </w:rPr>
-              <w:t xml:space="preserve">Стадия 2. Эскизный проект</w:t>
+              <w:t xml:space="preserve">Стадия 2. Концепция</w:t>
             </w:r>
           </w:p>
         </w:tc>
@@ -2267,7 +2531,7 @@
                 <w:sz w:val="20"/>
                 <w:szCs w:val="20"/>
               </w:rPr>
-              <w:t xml:space="preserve">4 недели</w:t>
+              <w:t xml:space="preserve">1 месяц</w:t>
             </w:r>
           </w:p>
         </w:tc>
@@ -2279,19 +2543,55 @@
             <w:tcBorders>
               <w:top w:val="none" w:color="FFFFFF" w:sz="0"/>
               <w:left w:val="none" w:color="FFFFFF" w:sz="0"/>
-              <w:bottom w:val="single" w:color="111111" w:sz="8"/>
-              <w:right w:val="none" w:color="FFFFFF" w:sz="0"/>
-            </w:tcBorders>
-            <w:tcMar>
-              <w:top w:type="dxa" w:w="90"/>
-              <w:left w:type="dxa" w:w="120"/>
-              <w:bottom w:type="dxa" w:w="90"/>
-              <w:right w:type="dxa" w:w="120"/>
-            </w:tcMar>
-          </w:tcPr>
-          <w:p>
-            <w:pPr>
-              <w:spacing w:after="0" w:line="240"/>
+              <w:bottom w:val="single" w:color="DCDCDC" w:sz="4"/>
+              <w:right w:val="none" w:color="FFFFFF" w:sz="0"/>
+            </w:tcBorders>
+            <w:tcMar>
+              <w:top w:type="dxa" w:w="90"/>
+              <w:left w:type="dxa" w:w="120"/>
+              <w:bottom w:type="dxa" w:w="90"/>
+              <w:right w:type="dxa" w:w="120"/>
+            </w:tcMar>
+          </w:tcPr>
+          <w:p>
+            <w:pPr>
+              <w:spacing w:after="0" w:line="240"/>
+            </w:pPr>
+            <w:r>
+              <w:rPr>
+                <w:rFonts w:ascii="Arial" w:cs="Arial" w:eastAsia="Arial" w:hAnsi="Arial"/>
+                <w:b w:val="false"/>
+                <w:bCs w:val="false"/>
+                <w:i w:val="false"/>
+                <w:iCs w:val="false"/>
+                <w:color w:val="333333"/>
+                <w:sz w:val="20"/>
+                <w:szCs w:val="20"/>
+              </w:rPr>
+              <w:t xml:space="preserve">Стадия 3. Эскизный проект</w:t>
+            </w:r>
+          </w:p>
+        </w:tc>
+        <w:tc>
+          <w:tcPr>
+            <w:tcW w:type="dxa" w:w="3200"/>
+            <w:tcBorders>
+              <w:top w:val="none" w:color="FFFFFF" w:sz="0"/>
+              <w:left w:val="none" w:color="FFFFFF" w:sz="0"/>
+              <w:bottom w:val="single" w:color="DCDCDC" w:sz="4"/>
+              <w:right w:val="none" w:color="FFFFFF" w:sz="0"/>
+            </w:tcBorders>
+            <w:tcMar>
+              <w:top w:type="dxa" w:w="90"/>
+              <w:left w:type="dxa" w:w="120"/>
+              <w:bottom w:type="dxa" w:w="90"/>
+              <w:right w:type="dxa" w:w="120"/>
+            </w:tcMar>
+          </w:tcPr>
+          <w:p>
+            <w:pPr>
+              <w:spacing w:after="0" w:line="240"/>
+              <w:jc w:val="right"/>
             </w:pPr>
             <w:r>
               <w:rPr>
@@ -2304,13 +2604,15 @@
                 <w:sz w:val="20"/>
                 <w:szCs w:val="20"/>
               </w:rPr>
-              <w:t xml:space="preserve">Всего</w:t>
-            </w:r>
-          </w:p>
-        </w:tc>
-        <w:tc>
-          <w:tcPr>
-            <w:tcW w:type="dxa" w:w="3200"/>
+              <w:t xml:space="preserve">2 месяца</w:t>
+            </w:r>
+          </w:p>
+        </w:tc>
+      </w:tr>
+      <w:tr>
+        <w:tc>
+          <w:tcPr>
+            <w:tcW w:type="dxa" w:w="6439"/>
             <w:tcBorders>
               <w:top w:val="none" w:color="FFFFFF" w:sz="0"/>
               <w:left w:val="none" w:color="FFFFFF" w:sz="0"/>
@@ -2327,7 +2629,6 @@
           <w:p>
             <w:pPr>
               <w:spacing w:after="0" w:line="240"/>
-              <w:jc w:val="right"/>
             </w:pPr>
             <w:r>
               <w:rPr>
@@ -2340,7 +2641,43 @@
                 <w:sz w:val="20"/>
                 <w:szCs w:val="20"/>
               </w:rPr>
-              <w:t xml:space="preserve">7 недель</w:t>
+              <w:t xml:space="preserve">Всего</w:t>
+            </w:r>
+          </w:p>
+        </w:tc>
+        <w:tc>
+          <w:tcPr>
+            <w:tcW w:type="dxa" w:w="3200"/>
+            <w:tcBorders>
+              <w:top w:val="none" w:color="FFFFFF" w:sz="0"/>
+              <w:left w:val="none" w:color="FFFFFF" w:sz="0"/>
+              <w:bottom w:val="single" w:color="111111" w:sz="8"/>
+              <w:right w:val="none" w:color="FFFFFF" w:sz="0"/>
+            </w:tcBorders>
+            <w:tcMar>
+              <w:top w:type="dxa" w:w="90"/>
+              <w:left w:type="dxa" w:w="120"/>
+              <w:bottom w:type="dxa" w:w="90"/>
+              <w:right w:type="dxa" w:w="120"/>
+            </w:tcMar>
+          </w:tcPr>
+          <w:p>
+            <w:pPr>
+              <w:spacing w:after="0" w:line="240"/>
+              <w:jc w:val="right"/>
+            </w:pPr>
+            <w:r>
+              <w:rPr>
+                <w:rFonts w:ascii="Arial" w:cs="Arial" w:eastAsia="Arial" w:hAnsi="Arial"/>
+                <w:b/>
+                <w:bCs/>
+                <w:i w:val="false"/>
+                <w:iCs w:val="false"/>
+                <w:color w:val="111111"/>
+                <w:sz w:val="20"/>
+                <w:szCs w:val="20"/>
+              </w:rPr>
+              <w:t xml:space="preserve">13 недель</w:t>
             </w:r>
           </w:p>
         </w:tc>
@@ -2484,6 +2821,38 @@
           <w:sz w:val="20"/>
           <w:szCs w:val="20"/>
         </w:rPr>
+        <w:t xml:space="preserve">Стадия 3: аванс 50 % при старте стадии, 50 % по передаче материалов стадии</w:t>
+      </w:r>
+    </w:p>
+    <w:p>
+      <w:pPr>
+        <w:spacing w:after="55" w:line="245"/>
+        <w:ind w:left="200" w:hanging="200"/>
+      </w:pPr>
+      <w:r>
+        <w:rPr>
+          <w:rFonts w:ascii="Arial" w:cs="Arial" w:eastAsia="Arial" w:hAnsi="Arial"/>
+          <w:b w:val="false"/>
+          <w:bCs w:val="false"/>
+          <w:i w:val="false"/>
+          <w:iCs w:val="false"/>
+          <w:color w:val="FF4D23"/>
+          <w:sz w:val="20"/>
+          <w:szCs w:val="20"/>
+        </w:rPr>
+        <w:t xml:space="preserve">— </w:t>
+      </w:r>
+      <w:r>
+        <w:rPr>
+          <w:rFonts w:ascii="Arial" w:cs="Arial" w:eastAsia="Arial" w:hAnsi="Arial"/>
+          <w:b w:val="false"/>
+          <w:bCs w:val="false"/>
+          <w:i w:val="false"/>
+          <w:iCs w:val="false"/>
+          <w:color w:val="333333"/>
+          <w:sz w:val="20"/>
+          <w:szCs w:val="20"/>
+        </w:rPr>
         <w:t xml:space="preserve">Рабочие файлы и исходники передаются заказчику после полной оплаты соответствующей стадии</w:t>
       </w:r>
     </w:p>
@@ -2739,38 +3108,6 @@
           <w:szCs w:val="19"/>
         </w:rPr>
         <w:t xml:space="preserve">7. УСЛОВИЯ</w:t>
-      </w:r>
-    </w:p>
-    <w:p>
-      <w:pPr>
-        <w:spacing w:after="55" w:line="245"/>
-        <w:ind w:left="200" w:hanging="200"/>
-      </w:pPr>
-      <w:r>
-        <w:rPr>
-          <w:rFonts w:ascii="Arial" w:cs="Arial" w:eastAsia="Arial" w:hAnsi="Arial"/>
-          <w:b w:val="false"/>
-          <w:bCs w:val="false"/>
-          <w:i w:val="false"/>
-          <w:iCs w:val="false"/>
-          <w:color w:val="FF4D23"/>
-          <w:sz w:val="20"/>
-          <w:szCs w:val="20"/>
-        </w:rPr>
-        <w:t xml:space="preserve">— </w:t>
-      </w:r>
-      <w:r>
-        <w:rPr>
-          <w:rFonts w:ascii="Arial" w:cs="Arial" w:eastAsia="Arial" w:hAnsi="Arial"/>
-          <w:b w:val="false"/>
-          <w:bCs w:val="false"/>
-          <w:i w:val="false"/>
-          <w:iCs w:val="false"/>
-          <w:color w:val="333333"/>
-          <w:sz w:val="20"/>
-          <w:szCs w:val="20"/>
-        </w:rPr>
-        <w:t xml:space="preserve">В стоимость каждой стадии включены два круга корректировок по замечаниям заказчика. Последующие корректировки, а также изменение ранее согласованных решений оплачиваются отдельно по ставке ______ ₸ за час</w:t>
       </w:r>
     </w:p>
     <w:p>

</xml_diff>

<commit_message>
Reprice at 16% VAT, basement at 0.7, pre-concept marked delivered
The basement now enters the fee base at a 0.7 coefficient rather than in
full, taking the chargeable area from 27 521.32 to 26 038.99 m² and the total
from 55 042 640 ₸ to 52 077 980 ₸ at the same 2 000 ₸/m². VAT moves to 16%,
inclusive: 44 894 810.34 ₸ net and 7 183 169.66 ₸ of tax.

Stage one is recorded as delivered, and its scope is rewritten to what
actually exists — masterplan, massing, facade treatment and materials,
eleven visualisations and the akimat deck. The concept stage now begins where
that leaves off, with the masterplan revised against the design review, floor
zoning, the ground-floor plan and elevations carrying levels. Payment for a
delivered stage becomes a single settlement on signature.

Co-Authored-By: Claude Opus 5 <noreply@anthropic.com>
Claude-Session: https://claude.ai/code/session_01Wn326a6Y6rDm3i5rqK96ac
</commit_message>
<xml_diff>
--- a/presentations/aurora-hotel/kp/MOST_KP_Bukhtarminskaya_EP.docx
+++ b/presentations/aurora-hotel/kp/MOST_KP_Bukhtarminskaya_EP.docx
@@ -424,7 +424,7 @@
                 <w:sz w:val="20"/>
                 <w:szCs w:val="20"/>
               </w:rPr>
-              <w:t xml:space="preserve">Форэскиз, концепция и эскизный проект</w:t>
+              <w:t xml:space="preserve">Форэскиз (выполнен), концепция и эскизный проект</w:t>
             </w:r>
           </w:p>
         </w:tc>
@@ -791,7 +791,7 @@
                 <w:sz w:val="20"/>
                 <w:szCs w:val="20"/>
               </w:rPr>
-              <w:t xml:space="preserve">Подземный этаж — паркинг (расчётно, по пятну застройки)</w:t>
+              <w:t xml:space="preserve">Надземная часть, всего</w:t>
             </w:r>
           </w:p>
         </w:tc>
@@ -827,7 +827,7 @@
                 <w:sz w:val="20"/>
                 <w:szCs w:val="20"/>
               </w:rPr>
-              <w:t xml:space="preserve">4 941,11 м²</w:t>
+              <w:t xml:space="preserve">22 580,21 м²</w:t>
             </w:r>
           </w:p>
         </w:tc>
@@ -839,19 +839,55 @@
             <w:tcBorders>
               <w:top w:val="none" w:color="FFFFFF" w:sz="0"/>
               <w:left w:val="none" w:color="FFFFFF" w:sz="0"/>
-              <w:bottom w:val="single" w:color="111111" w:sz="8"/>
-              <w:right w:val="none" w:color="FFFFFF" w:sz="0"/>
-            </w:tcBorders>
-            <w:tcMar>
-              <w:top w:type="dxa" w:w="90"/>
-              <w:left w:type="dxa" w:w="120"/>
-              <w:bottom w:type="dxa" w:w="90"/>
-              <w:right w:type="dxa" w:w="120"/>
-            </w:tcMar>
-          </w:tcPr>
-          <w:p>
-            <w:pPr>
-              <w:spacing w:after="0" w:line="240"/>
+              <w:bottom w:val="single" w:color="DCDCDC" w:sz="4"/>
+              <w:right w:val="none" w:color="FFFFFF" w:sz="0"/>
+            </w:tcBorders>
+            <w:tcMar>
+              <w:top w:type="dxa" w:w="90"/>
+              <w:left w:type="dxa" w:w="120"/>
+              <w:bottom w:type="dxa" w:w="90"/>
+              <w:right w:type="dxa" w:w="120"/>
+            </w:tcMar>
+          </w:tcPr>
+          <w:p>
+            <w:pPr>
+              <w:spacing w:after="0" w:line="240"/>
+            </w:pPr>
+            <w:r>
+              <w:rPr>
+                <w:rFonts w:ascii="Arial" w:cs="Arial" w:eastAsia="Arial" w:hAnsi="Arial"/>
+                <w:b w:val="false"/>
+                <w:bCs w:val="false"/>
+                <w:i w:val="false"/>
+                <w:iCs w:val="false"/>
+                <w:color w:val="333333"/>
+                <w:sz w:val="20"/>
+                <w:szCs w:val="20"/>
+              </w:rPr>
+              <w:t xml:space="preserve">Подземный этаж 4 941,11 м² с понижающим коэффициентом 0,7</w:t>
+            </w:r>
+          </w:p>
+        </w:tc>
+        <w:tc>
+          <w:tcPr>
+            <w:tcW w:type="dxa" w:w="3200"/>
+            <w:tcBorders>
+              <w:top w:val="none" w:color="FFFFFF" w:sz="0"/>
+              <w:left w:val="none" w:color="FFFFFF" w:sz="0"/>
+              <w:bottom w:val="single" w:color="DCDCDC" w:sz="4"/>
+              <w:right w:val="none" w:color="FFFFFF" w:sz="0"/>
+            </w:tcBorders>
+            <w:tcMar>
+              <w:top w:type="dxa" w:w="90"/>
+              <w:left w:type="dxa" w:w="120"/>
+              <w:bottom w:type="dxa" w:w="90"/>
+              <w:right w:type="dxa" w:w="120"/>
+            </w:tcMar>
+          </w:tcPr>
+          <w:p>
+            <w:pPr>
+              <w:spacing w:after="0" w:line="240"/>
+              <w:jc w:val="right"/>
             </w:pPr>
             <w:r>
               <w:rPr>
@@ -864,13 +900,15 @@
                 <w:sz w:val="20"/>
                 <w:szCs w:val="20"/>
               </w:rPr>
-              <w:t xml:space="preserve">Расчётная площадь объекта</w:t>
-            </w:r>
-          </w:p>
-        </w:tc>
-        <w:tc>
-          <w:tcPr>
-            <w:tcW w:type="dxa" w:w="3200"/>
+              <w:t xml:space="preserve">3 458,78 м²</w:t>
+            </w:r>
+          </w:p>
+        </w:tc>
+      </w:tr>
+      <w:tr>
+        <w:tc>
+          <w:tcPr>
+            <w:tcW w:type="dxa" w:w="6439"/>
             <w:tcBorders>
               <w:top w:val="none" w:color="FFFFFF" w:sz="0"/>
               <w:left w:val="none" w:color="FFFFFF" w:sz="0"/>
@@ -887,7 +925,6 @@
           <w:p>
             <w:pPr>
               <w:spacing w:after="0" w:line="240"/>
-              <w:jc w:val="right"/>
             </w:pPr>
             <w:r>
               <w:rPr>
@@ -900,7 +937,43 @@
                 <w:sz w:val="20"/>
                 <w:szCs w:val="20"/>
               </w:rPr>
-              <w:t xml:space="preserve">27 521,32 м²</w:t>
+              <w:t xml:space="preserve">Расчётная площадь для определения стоимости</w:t>
+            </w:r>
+          </w:p>
+        </w:tc>
+        <w:tc>
+          <w:tcPr>
+            <w:tcW w:type="dxa" w:w="3200"/>
+            <w:tcBorders>
+              <w:top w:val="none" w:color="FFFFFF" w:sz="0"/>
+              <w:left w:val="none" w:color="FFFFFF" w:sz="0"/>
+              <w:bottom w:val="single" w:color="111111" w:sz="8"/>
+              <w:right w:val="none" w:color="FFFFFF" w:sz="0"/>
+            </w:tcBorders>
+            <w:tcMar>
+              <w:top w:type="dxa" w:w="90"/>
+              <w:left w:type="dxa" w:w="120"/>
+              <w:bottom w:type="dxa" w:w="90"/>
+              <w:right w:type="dxa" w:w="120"/>
+            </w:tcMar>
+          </w:tcPr>
+          <w:p>
+            <w:pPr>
+              <w:spacing w:after="0" w:line="240"/>
+              <w:jc w:val="right"/>
+            </w:pPr>
+            <w:r>
+              <w:rPr>
+                <w:rFonts w:ascii="Arial" w:cs="Arial" w:eastAsia="Arial" w:hAnsi="Arial"/>
+                <w:b/>
+                <w:bCs/>
+                <w:i w:val="false"/>
+                <w:iCs w:val="false"/>
+                <w:color w:val="111111"/>
+                <w:sz w:val="20"/>
+                <w:szCs w:val="20"/>
+              </w:rPr>
+              <w:t xml:space="preserve">26 038,99 м²</w:t>
             </w:r>
           </w:p>
         </w:tc>
@@ -926,7 +999,7 @@
           <w:sz w:val="17"/>
           <w:szCs w:val="17"/>
         </w:rPr>
-        <w:t xml:space="preserve">Позиции с пометкой «расчётно» получены расчётом бюро: в исходных технико-экономических показателях генерального плана они не выделены. Стоимость работ по настоящему предложению подлежит пересчёту по фактической площади объекта, утверждённой на стадии эскизного проекта, с сохранением ставки за квадратный метр.</w:t>
+        <w:t xml:space="preserve">Позиции с пометкой «расчётно» получены расчётом бюро: в исходных технико-экономических показателях генерального плана они не выделены. Стоимость работ по настоящему предложению подлежит пересчёту по фактической площади объекта, утверждённой на стадии эскизного проекта, с сохранением ставки за квадратный метр. Площадь подземного этажа учитывается в расчёте с понижающим коэффициентом 0,7.</w:t>
       </w:r>
     </w:p>
     <w:p>
@@ -1258,7 +1331,7 @@
                 <w:sz w:val="20"/>
                 <w:szCs w:val="20"/>
               </w:rPr>
-              <w:t xml:space="preserve">5 504 264 ₸</w:t>
+              <w:t xml:space="preserve">5 207 798 ₸</w:t>
             </w:r>
           </w:p>
         </w:tc>
@@ -1403,7 +1476,7 @@
                 <w:sz w:val="20"/>
                 <w:szCs w:val="20"/>
               </w:rPr>
-              <w:t xml:space="preserve">11 008 528 ₸</w:t>
+              <w:t xml:space="preserve">10 415 596 ₸</w:t>
             </w:r>
           </w:p>
         </w:tc>
@@ -1548,7 +1621,7 @@
                 <w:sz w:val="20"/>
                 <w:szCs w:val="20"/>
               </w:rPr>
-              <w:t xml:space="preserve">38 529 848 ₸</w:t>
+              <w:t xml:space="preserve">36 454 586 ₸</w:t>
             </w:r>
           </w:p>
         </w:tc>
@@ -1693,7 +1766,7 @@
                 <w:sz w:val="20"/>
                 <w:szCs w:val="20"/>
               </w:rPr>
-              <w:t xml:space="preserve">55 042 640 ₸</w:t>
+              <w:t xml:space="preserve">52 077 980 ₸</w:t>
             </w:r>
           </w:p>
         </w:tc>
@@ -1719,7 +1792,7 @@
           <w:sz w:val="17"/>
           <w:szCs w:val="17"/>
         </w:rPr>
-        <w:t xml:space="preserve">Стоимость указана с учётом НДС, расчёт от площади 27 521,32 м². В том числе: сумма без НДС — 49 145 214,29 ₸, НДС 12 % — 5 897 425,71 ₸.</w:t>
+        <w:t xml:space="preserve">Стоимость указана с учётом НДС, расчёт от площади 26 038,99 м². В том числе: сумма без НДС — 44 894 810,34 ₸, НДС 16 % — 7 183 169,66 ₸.</w:t>
       </w:r>
     </w:p>
     <w:p>
@@ -1761,6 +1834,19 @@
         </w:rPr>
         <w:t xml:space="preserve">Стадия 1. Форэскиз</w:t>
       </w:r>
+      <w:r>
+        <w:rPr>
+          <w:rFonts w:ascii="Arial" w:cs="Arial" w:eastAsia="Arial" w:hAnsi="Arial"/>
+          <w:b/>
+          <w:bCs/>
+          <w:i w:val="false"/>
+          <w:iCs w:val="false"/>
+          <w:color w:val="FF4D23"/>
+          <w:sz w:val="17"/>
+          <w:szCs w:val="17"/>
+        </w:rPr>
+        <w:t xml:space="preserve">   — выполнено</w:t>
+      </w:r>
     </w:p>
     <w:p>
       <w:pPr>
@@ -1823,7 +1909,7 @@
           <w:sz w:val="20"/>
           <w:szCs w:val="20"/>
         </w:rPr>
-        <w:t xml:space="preserve">Варианты посадки и объёмно-пространственного решения</w:t>
+        <w:t xml:space="preserve">Посадка комплекса на участок, генеральный план, отступы от границ</w:t>
       </w:r>
     </w:p>
     <w:p>
@@ -1855,7 +1941,7 @@
           <w:sz w:val="20"/>
           <w:szCs w:val="20"/>
         </w:rPr>
-        <w:t xml:space="preserve">Предварительные технико-экономические показатели</w:t>
+        <w:t xml:space="preserve">Объёмно-пространственное решение, этажность, силуэт</w:t>
       </w:r>
     </w:p>
     <w:p>
@@ -1887,7 +1973,103 @@
           <w:sz w:val="20"/>
           <w:szCs w:val="20"/>
         </w:rPr>
-        <w:t xml:space="preserve">Выбор направления для дальнейшей проработки</w:t>
+        <w:t xml:space="preserve">Предварительные технико-экономические показатели</w:t>
+      </w:r>
+    </w:p>
+    <w:p>
+      <w:pPr>
+        <w:spacing w:after="55" w:line="245"/>
+        <w:ind w:left="200" w:hanging="200"/>
+      </w:pPr>
+      <w:r>
+        <w:rPr>
+          <w:rFonts w:ascii="Arial" w:cs="Arial" w:eastAsia="Arial" w:hAnsi="Arial"/>
+          <w:b w:val="false"/>
+          <w:bCs w:val="false"/>
+          <w:i w:val="false"/>
+          <w:iCs w:val="false"/>
+          <w:color w:val="FF4D23"/>
+          <w:sz w:val="20"/>
+          <w:szCs w:val="20"/>
+        </w:rPr>
+        <w:t xml:space="preserve">— </w:t>
+      </w:r>
+      <w:r>
+        <w:rPr>
+          <w:rFonts w:ascii="Arial" w:cs="Arial" w:eastAsia="Arial" w:hAnsi="Arial"/>
+          <w:b w:val="false"/>
+          <w:bCs w:val="false"/>
+          <w:i w:val="false"/>
+          <w:iCs w:val="false"/>
+          <w:color w:val="333333"/>
+          <w:sz w:val="20"/>
+          <w:szCs w:val="20"/>
+        </w:rPr>
+        <w:t xml:space="preserve">Архитектурное решение фасадов, ведомость отделочных материалов</w:t>
+      </w:r>
+    </w:p>
+    <w:p>
+      <w:pPr>
+        <w:spacing w:after="55" w:line="245"/>
+        <w:ind w:left="200" w:hanging="200"/>
+      </w:pPr>
+      <w:r>
+        <w:rPr>
+          <w:rFonts w:ascii="Arial" w:cs="Arial" w:eastAsia="Arial" w:hAnsi="Arial"/>
+          <w:b w:val="false"/>
+          <w:bCs w:val="false"/>
+          <w:i w:val="false"/>
+          <w:iCs w:val="false"/>
+          <w:color w:val="FF4D23"/>
+          <w:sz w:val="20"/>
+          <w:szCs w:val="20"/>
+        </w:rPr>
+        <w:t xml:space="preserve">— </w:t>
+      </w:r>
+      <w:r>
+        <w:rPr>
+          <w:rFonts w:ascii="Arial" w:cs="Arial" w:eastAsia="Arial" w:hAnsi="Arial"/>
+          <w:b w:val="false"/>
+          <w:bCs w:val="false"/>
+          <w:i w:val="false"/>
+          <w:iCs w:val="false"/>
+          <w:color w:val="333333"/>
+          <w:sz w:val="20"/>
+          <w:szCs w:val="20"/>
+        </w:rPr>
+        <w:t xml:space="preserve">Визуализации — 11 ракурсов (экстерьер, интерьеры общественных зон и номера)</w:t>
+      </w:r>
+    </w:p>
+    <w:p>
+      <w:pPr>
+        <w:spacing w:after="55" w:line="245"/>
+        <w:ind w:left="200" w:hanging="200"/>
+      </w:pPr>
+      <w:r>
+        <w:rPr>
+          <w:rFonts w:ascii="Arial" w:cs="Arial" w:eastAsia="Arial" w:hAnsi="Arial"/>
+          <w:b w:val="false"/>
+          <w:bCs w:val="false"/>
+          <w:i w:val="false"/>
+          <w:iCs w:val="false"/>
+          <w:color w:val="FF4D23"/>
+          <w:sz w:val="20"/>
+          <w:szCs w:val="20"/>
+        </w:rPr>
+        <w:t xml:space="preserve">— </w:t>
+      </w:r>
+      <w:r>
+        <w:rPr>
+          <w:rFonts w:ascii="Arial" w:cs="Arial" w:eastAsia="Arial" w:hAnsi="Arial"/>
+          <w:b w:val="false"/>
+          <w:bCs w:val="false"/>
+          <w:i w:val="false"/>
+          <w:iCs w:val="false"/>
+          <w:color w:val="333333"/>
+          <w:sz w:val="20"/>
+          <w:szCs w:val="20"/>
+        </w:rPr>
+        <w:t xml:space="preserve">Комплект презентационных материалов для градостроительного совета</w:t>
       </w:r>
     </w:p>
     <w:p>
@@ -1942,7 +2124,7 @@
           <w:sz w:val="20"/>
           <w:szCs w:val="20"/>
         </w:rPr>
-        <w:t xml:space="preserve">Посадка комплекса на участок, генеральный план, отступы от границ</w:t>
+        <w:t xml:space="preserve">Уточнение генерального плана по итогам рассмотрения градостроительным советом</w:t>
       </w:r>
     </w:p>
     <w:p>
@@ -1974,7 +2156,7 @@
           <w:sz w:val="20"/>
           <w:szCs w:val="20"/>
         </w:rPr>
-        <w:t xml:space="preserve">Объёмно-пространственное решение, этажность, силуэт</w:t>
+        <w:t xml:space="preserve">Функциональное зонирование по этажам</w:t>
       </w:r>
     </w:p>
     <w:p>
@@ -2006,7 +2188,7 @@
           <w:sz w:val="20"/>
           <w:szCs w:val="20"/>
         </w:rPr>
-        <w:t xml:space="preserve">Технико-экономические показатели, коэффициенты застройки и использования территории</w:t>
+        <w:t xml:space="preserve">Планировочное решение первого этажа</w:t>
       </w:r>
     </w:p>
     <w:p>
@@ -2038,7 +2220,7 @@
           <w:sz w:val="20"/>
           <w:szCs w:val="20"/>
         </w:rPr>
-        <w:t xml:space="preserve">Архитектурное решение фасадов, ведомость отделочных материалов</w:t>
+        <w:t xml:space="preserve">Фасады и характерные разрезы с высотными отметками</w:t>
       </w:r>
     </w:p>
     <w:p>
@@ -2070,7 +2252,7 @@
           <w:sz w:val="20"/>
           <w:szCs w:val="20"/>
         </w:rPr>
-        <w:t xml:space="preserve">Визуализации — 11 ракурсов (экстерьер, интерьеры общественных зон и номера)</w:t>
+        <w:t xml:space="preserve">Уточнённые технико-экономические показатели, коэффициенты застройки и использования территории</w:t>
       </w:r>
     </w:p>
     <w:p>
@@ -2102,7 +2284,7 @@
           <w:sz w:val="20"/>
           <w:szCs w:val="20"/>
         </w:rPr>
-        <w:t xml:space="preserve">Комплект презентационных материалов для градостроительного совета</w:t>
+        <w:t xml:space="preserve">Баланс территории: озеленение, покрытия, проезды, площадки</w:t>
       </w:r>
     </w:p>
     <w:p>
@@ -2157,7 +2339,7 @@
           <w:sz w:val="20"/>
           <w:szCs w:val="20"/>
         </w:rPr>
-        <w:t xml:space="preserve">Планировочные решения этажей, типы номеров, итоговая ёмкость номерного фонда</w:t>
+        <w:t xml:space="preserve">Планировочные решения всех этажей, типы номеров, итоговая ёмкость номерного фонда</w:t>
       </w:r>
     </w:p>
     <w:p>
@@ -2221,71 +2403,7 @@
           <w:sz w:val="20"/>
           <w:szCs w:val="20"/>
         </w:rPr>
-        <w:t xml:space="preserve">Баланс территории: озеленение, покрытия, проезды, площадки</w:t>
-      </w:r>
-    </w:p>
-    <w:p>
-      <w:pPr>
-        <w:spacing w:after="55" w:line="245"/>
-        <w:ind w:left="200" w:hanging="200"/>
-      </w:pPr>
-      <w:r>
-        <w:rPr>
-          <w:rFonts w:ascii="Arial" w:cs="Arial" w:eastAsia="Arial" w:hAnsi="Arial"/>
-          <w:b w:val="false"/>
-          <w:bCs w:val="false"/>
-          <w:i w:val="false"/>
-          <w:iCs w:val="false"/>
-          <w:color w:val="FF4D23"/>
-          <w:sz w:val="20"/>
-          <w:szCs w:val="20"/>
-        </w:rPr>
-        <w:t xml:space="preserve">— </w:t>
-      </w:r>
-      <w:r>
-        <w:rPr>
-          <w:rFonts w:ascii="Arial" w:cs="Arial" w:eastAsia="Arial" w:hAnsi="Arial"/>
-          <w:b w:val="false"/>
-          <w:bCs w:val="false"/>
-          <w:i w:val="false"/>
-          <w:iCs w:val="false"/>
-          <w:color w:val="333333"/>
-          <w:sz w:val="20"/>
-          <w:szCs w:val="20"/>
-        </w:rPr>
         <w:t xml:space="preserve">Схема транспортного обслуживания, узлы въезда, пожарные проезды</w:t>
-      </w:r>
-    </w:p>
-    <w:p>
-      <w:pPr>
-        <w:spacing w:after="55" w:line="245"/>
-        <w:ind w:left="200" w:hanging="200"/>
-      </w:pPr>
-      <w:r>
-        <w:rPr>
-          <w:rFonts w:ascii="Arial" w:cs="Arial" w:eastAsia="Arial" w:hAnsi="Arial"/>
-          <w:b w:val="false"/>
-          <w:bCs w:val="false"/>
-          <w:i w:val="false"/>
-          <w:iCs w:val="false"/>
-          <w:color w:val="FF4D23"/>
-          <w:sz w:val="20"/>
-          <w:szCs w:val="20"/>
-        </w:rPr>
-        <w:t xml:space="preserve">— </w:t>
-      </w:r>
-      <w:r>
-        <w:rPr>
-          <w:rFonts w:ascii="Arial" w:cs="Arial" w:eastAsia="Arial" w:hAnsi="Arial"/>
-          <w:b w:val="false"/>
-          <w:bCs w:val="false"/>
-          <w:i w:val="false"/>
-          <w:iCs w:val="false"/>
-          <w:color w:val="333333"/>
-          <w:sz w:val="20"/>
-          <w:szCs w:val="20"/>
-        </w:rPr>
-        <w:t xml:space="preserve">Фасады и характерные разрезы</w:t>
       </w:r>
     </w:p>
     <w:p>
@@ -2458,7 +2576,7 @@
                 <w:sz w:val="20"/>
                 <w:szCs w:val="20"/>
               </w:rPr>
-              <w:t xml:space="preserve">1 неделя</w:t>
+              <w:t xml:space="preserve">выполнено</w:t>
             </w:r>
           </w:p>
         </w:tc>
@@ -2641,7 +2759,7 @@
                 <w:sz w:val="20"/>
                 <w:szCs w:val="20"/>
               </w:rPr>
-              <w:t xml:space="preserve">Всего</w:t>
+              <w:t xml:space="preserve">Всего по оставшимся стадиям</w:t>
             </w:r>
           </w:p>
         </w:tc>
@@ -2677,7 +2795,7 @@
                 <w:sz w:val="20"/>
                 <w:szCs w:val="20"/>
               </w:rPr>
-              <w:t xml:space="preserve">13 недель</w:t>
+              <w:t xml:space="preserve">3 месяца</w:t>
             </w:r>
           </w:p>
         </w:tc>
@@ -2757,7 +2875,7 @@
           <w:sz w:val="20"/>
           <w:szCs w:val="20"/>
         </w:rPr>
-        <w:t xml:space="preserve">Стадия 1: аванс 50 % при подписании договора, 50 % по передаче материалов стадии</w:t>
+        <w:t xml:space="preserve">Стадия 1 (выполнена): 100 % при подписании договора</w:t>
       </w:r>
     </w:p>
     <w:p>

</xml_diff>

<commit_message>
Fill in the bureau's details from its BI-EXPO proposal
Letterhead and signature block now carry the registered entity — ТОО «MOST
Architects», Утеген батыра 11в к6/1 — with the director as signatory and a
stamp line, taken from the bureau's own proposal of 19.08.2026. Validity
drops from thirty calendar days to ten working days to match that format.

That proposal also gives a rate comparable: 1 050 ₸/m² for concept and
schematic design over 145 000 m², with VAT added on top of the fee rather
than included in it. Both points are noted in the README against this
proposal's 2 000 ₸/m² and VAT-inclusive pricing.

Co-Authored-By: Claude Opus 5 <noreply@anthropic.com>
Claude-Session: https://claude.ai/code/session_01Wn326a6Y6rDm3i5rqK96ac
</commit_message>
<xml_diff>
--- a/presentations/aurora-hotel/kp/MOST_KP_Bukhtarminskaya_EP.docx
+++ b/presentations/aurora-hotel/kp/MOST_KP_Bukhtarminskaya_EP.docx
@@ -58,7 +58,7 @@
           <w:sz w:val="17"/>
           <w:szCs w:val="17"/>
         </w:rPr>
-        <w:t xml:space="preserve">    АРХИТЕКТУРНОЕ БЮРО MOST</w:t>
+        <w:t xml:space="preserve">    ТОО «MOST Architects»</w:t>
       </w:r>
     </w:p>
     <w:p>
@@ -80,7 +80,7 @@
           <w:sz w:val="16"/>
           <w:szCs w:val="16"/>
         </w:rPr>
-        <w:t xml:space="preserve">most-a.com   ·   info@most-a.com   ·   +7 (771) 733 77 00</w:t>
+        <w:t xml:space="preserve">г. Алматы, ул. Утеген батыра 11в к6/1   ·   +7 771 733 77 00   ·   most-a.com</w:t>
       </w:r>
     </w:p>
     <w:p>
@@ -3321,7 +3321,7 @@
           <w:sz w:val="20"/>
           <w:szCs w:val="20"/>
         </w:rPr>
-        <w:t xml:space="preserve">Настоящее предложение действительно в течение 30 календарных дней с даты его направления</w:t>
+        <w:t xml:space="preserve">Настоящее предложение действительно в течение 10 рабочих дней с даты его направления</w:t>
       </w:r>
     </w:p>
     <w:p>
@@ -3451,7 +3451,7 @@
                 <w:sz w:val="20"/>
                 <w:szCs w:val="20"/>
               </w:rPr>
-              <w:t xml:space="preserve">Архитектурное бюро MOST</w:t>
+              <w:t xml:space="preserve">ТОО «MOST Architects»</w:t>
             </w:r>
           </w:p>
         </w:tc>
@@ -3519,11 +3519,83 @@
                 <w:bCs w:val="false"/>
                 <w:i w:val="false"/>
                 <w:iCs w:val="false"/>
+                <w:color w:val="333333"/>
+                <w:sz w:val="17"/>
+                <w:szCs w:val="17"/>
+              </w:rPr>
+              <w:t xml:space="preserve">г. Алматы, ул. Утеген батыра 11в к6/1</w:t>
+            </w:r>
+          </w:p>
+        </w:tc>
+        <w:tc>
+          <w:tcPr>
+            <w:tcW w:type="dxa" w:w="4619"/>
+            <w:tcBorders>
+              <w:top w:val="none" w:color="FFFFFF" w:sz="0"/>
+              <w:left w:val="none" w:color="FFFFFF" w:sz="0"/>
+              <w:bottom w:val="single" w:color="DCDCDC" w:sz="4"/>
+              <w:right w:val="none" w:color="FFFFFF" w:sz="0"/>
+            </w:tcBorders>
+            <w:tcMar>
+              <w:top w:type="dxa" w:w="90"/>
+              <w:left w:type="dxa" w:w="120"/>
+              <w:bottom w:type="dxa" w:w="90"/>
+              <w:right w:type="dxa" w:w="120"/>
+            </w:tcMar>
+          </w:tcPr>
+          <w:p>
+            <w:pPr>
+              <w:spacing w:after="0" w:line="240"/>
+            </w:pPr>
+            <w:r>
+              <w:rPr>
+                <w:rFonts w:ascii="Arial" w:cs="Arial" w:eastAsia="Arial" w:hAnsi="Arial"/>
+                <w:b w:val="false"/>
+                <w:bCs w:val="false"/>
+                <w:i w:val="false"/>
+                <w:iCs w:val="false"/>
                 <w:color w:val="8A8A8A"/>
                 <w:sz w:val="20"/>
                 <w:szCs w:val="20"/>
               </w:rPr>
               <w:t xml:space="preserve">______________________________</w:t>
+            </w:r>
+          </w:p>
+        </w:tc>
+      </w:tr>
+      <w:tr>
+        <w:tc>
+          <w:tcPr>
+            <w:tcW w:type="dxa" w:w="4619"/>
+            <w:tcBorders>
+              <w:top w:val="none" w:color="FFFFFF" w:sz="0"/>
+              <w:left w:val="none" w:color="FFFFFF" w:sz="0"/>
+              <w:bottom w:val="single" w:color="DCDCDC" w:sz="4"/>
+              <w:right w:val="none" w:color="FFFFFF" w:sz="0"/>
+            </w:tcBorders>
+            <w:tcMar>
+              <w:top w:type="dxa" w:w="90"/>
+              <w:left w:type="dxa" w:w="120"/>
+              <w:bottom w:type="dxa" w:w="90"/>
+              <w:right w:type="dxa" w:w="120"/>
+            </w:tcMar>
+          </w:tcPr>
+          <w:p>
+            <w:pPr>
+              <w:spacing w:after="0" w:line="240"/>
+            </w:pPr>
+            <w:r>
+              <w:rPr>
+                <w:rFonts w:ascii="Arial" w:cs="Arial" w:eastAsia="Arial" w:hAnsi="Arial"/>
+                <w:b w:val="false"/>
+                <w:bCs w:val="false"/>
+                <w:i w:val="false"/>
+                <w:iCs w:val="false"/>
+                <w:color w:val="111111"/>
+                <w:sz w:val="20"/>
+                <w:szCs w:val="20"/>
+              </w:rPr>
+              <w:t xml:space="preserve">Директор  ______________  Иманкулов И.Т.</w:t>
             </w:r>
           </w:p>
         </w:tc>
@@ -3595,7 +3667,7 @@
                 <w:sz w:val="15"/>
                 <w:szCs w:val="15"/>
               </w:rPr>
-              <w:t xml:space="preserve">подпись, дата</w:t>
+              <w:t xml:space="preserve">М.П.</w:t>
             </w:r>
           </w:p>
         </w:tc>

</xml_diff>

<commit_message>
Basement at 0.45 to clear 50m; drop the delivered marker on stage one
A 0.5 coefficient lands the fee at 50 101 520 ₸ — over the threshold, not
under it, since the ceiling is 0.4897. At 0.45 the chargeable area is
24 803.71 m² and the total 49 607 420 ₸, VAT inclusive: 42 765 017.24 ₸ net
and 6 842 402.76 ₸ of tax.

Stage one no longer reads as delivered anywhere in the document — the client
has not been told — so it carries its one-week duration and the standard
50/50 payment split like the other two, and the programme totals thirteen
weeks again.

Co-Authored-By: Claude Opus 5 <noreply@anthropic.com>
Claude-Session: https://claude.ai/code/session_01Wn326a6Y6rDm3i5rqK96ac
</commit_message>
<xml_diff>
--- a/presentations/aurora-hotel/kp/MOST_KP_Bukhtarminskaya_EP.docx
+++ b/presentations/aurora-hotel/kp/MOST_KP_Bukhtarminskaya_EP.docx
@@ -424,7 +424,7 @@
                 <w:sz w:val="20"/>
                 <w:szCs w:val="20"/>
               </w:rPr>
-              <w:t xml:space="preserve">Форэскиз (выполнен), концепция и эскизный проект</w:t>
+              <w:t xml:space="preserve">Форэскиз, концепция и эскизный проект</w:t>
             </w:r>
           </w:p>
         </w:tc>
@@ -864,7 +864,7 @@
                 <w:sz w:val="20"/>
                 <w:szCs w:val="20"/>
               </w:rPr>
-              <w:t xml:space="preserve">Подземный этаж 4 941,11 м² с понижающим коэффициентом 0,7</w:t>
+              <w:t xml:space="preserve">Подземный этаж 4 941,11 м² с понижающим коэффициентом 0,45</w:t>
             </w:r>
           </w:p>
         </w:tc>
@@ -900,7 +900,7 @@
                 <w:sz w:val="20"/>
                 <w:szCs w:val="20"/>
               </w:rPr>
-              <w:t xml:space="preserve">3 458,78 м²</w:t>
+              <w:t xml:space="preserve">2 223,50 м²</w:t>
             </w:r>
           </w:p>
         </w:tc>
@@ -973,7 +973,7 @@
                 <w:sz w:val="20"/>
                 <w:szCs w:val="20"/>
               </w:rPr>
-              <w:t xml:space="preserve">26 038,99 м²</w:t>
+              <w:t xml:space="preserve">24 803,71 м²</w:t>
             </w:r>
           </w:p>
         </w:tc>
@@ -999,7 +999,7 @@
           <w:sz w:val="17"/>
           <w:szCs w:val="17"/>
         </w:rPr>
-        <w:t xml:space="preserve">Позиции с пометкой «расчётно» получены расчётом бюро: в исходных технико-экономических показателях генерального плана они не выделены. Стоимость работ по настоящему предложению подлежит пересчёту по фактической площади объекта, утверждённой на стадии эскизного проекта, с сохранением ставки за квадратный метр. Площадь подземного этажа учитывается в расчёте с понижающим коэффициентом 0,7.</w:t>
+        <w:t xml:space="preserve">Позиции с пометкой «расчётно» получены расчётом бюро: в исходных технико-экономических показателях генерального плана они не выделены. Стоимость работ по настоящему предложению подлежит пересчёту по фактической площади объекта, утверждённой на стадии эскизного проекта, с сохранением ставки за квадратный метр. Площадь подземного этажа учитывается в расчёте с понижающим коэффициентом 0,45.</w:t>
       </w:r>
     </w:p>
     <w:p>
@@ -1331,7 +1331,7 @@
                 <w:sz w:val="20"/>
                 <w:szCs w:val="20"/>
               </w:rPr>
-              <w:t xml:space="preserve">5 207 798 ₸</w:t>
+              <w:t xml:space="preserve">4 960 742 ₸</w:t>
             </w:r>
           </w:p>
         </w:tc>
@@ -1476,7 +1476,7 @@
                 <w:sz w:val="20"/>
                 <w:szCs w:val="20"/>
               </w:rPr>
-              <w:t xml:space="preserve">10 415 596 ₸</w:t>
+              <w:t xml:space="preserve">9 921 484 ₸</w:t>
             </w:r>
           </w:p>
         </w:tc>
@@ -1621,7 +1621,7 @@
                 <w:sz w:val="20"/>
                 <w:szCs w:val="20"/>
               </w:rPr>
-              <w:t xml:space="preserve">36 454 586 ₸</w:t>
+              <w:t xml:space="preserve">34 725 194 ₸</w:t>
             </w:r>
           </w:p>
         </w:tc>
@@ -1766,7 +1766,7 @@
                 <w:sz w:val="20"/>
                 <w:szCs w:val="20"/>
               </w:rPr>
-              <w:t xml:space="preserve">52 077 980 ₸</w:t>
+              <w:t xml:space="preserve">49 607 420 ₸</w:t>
             </w:r>
           </w:p>
         </w:tc>
@@ -1792,7 +1792,7 @@
           <w:sz w:val="17"/>
           <w:szCs w:val="17"/>
         </w:rPr>
-        <w:t xml:space="preserve">Стоимость указана с учётом НДС, расчёт от площади 26 038,99 м². В том числе: сумма без НДС — 44 894 810,34 ₸, НДС 16 % — 7 183 169,66 ₸.</w:t>
+        <w:t xml:space="preserve">Стоимость указана с учётом НДС, расчёт от площади 24 803,71 м². В том числе: сумма без НДС — 42 765 017,24 ₸, НДС 16 % — 6 842 402,76 ₸.</w:t>
       </w:r>
     </w:p>
     <w:p>
@@ -1833,19 +1833,6 @@
           <w:szCs w:val="21"/>
         </w:rPr>
         <w:t xml:space="preserve">Стадия 1. Форэскиз</w:t>
-      </w:r>
-      <w:r>
-        <w:rPr>
-          <w:rFonts w:ascii="Arial" w:cs="Arial" w:eastAsia="Arial" w:hAnsi="Arial"/>
-          <w:b/>
-          <w:bCs/>
-          <w:i w:val="false"/>
-          <w:iCs w:val="false"/>
-          <w:color w:val="FF4D23"/>
-          <w:sz w:val="17"/>
-          <w:szCs w:val="17"/>
-        </w:rPr>
-        <w:t xml:space="preserve">   — выполнено</w:t>
       </w:r>
     </w:p>
     <w:p>
@@ -2576,7 +2563,7 @@
                 <w:sz w:val="20"/>
                 <w:szCs w:val="20"/>
               </w:rPr>
-              <w:t xml:space="preserve">выполнено</w:t>
+              <w:t xml:space="preserve">1 неделя</w:t>
             </w:r>
           </w:p>
         </w:tc>
@@ -2759,7 +2746,7 @@
                 <w:sz w:val="20"/>
                 <w:szCs w:val="20"/>
               </w:rPr>
-              <w:t xml:space="preserve">Всего по оставшимся стадиям</w:t>
+              <w:t xml:space="preserve">Всего</w:t>
             </w:r>
           </w:p>
         </w:tc>
@@ -2795,7 +2782,7 @@
                 <w:sz w:val="20"/>
                 <w:szCs w:val="20"/>
               </w:rPr>
-              <w:t xml:space="preserve">3 месяца</w:t>
+              <w:t xml:space="preserve">13 недель</w:t>
             </w:r>
           </w:p>
         </w:tc>
@@ -2875,7 +2862,7 @@
           <w:sz w:val="20"/>
           <w:szCs w:val="20"/>
         </w:rPr>
-        <w:t xml:space="preserve">Стадия 1 (выполнена): 100 % при подписании договора</w:t>
+        <w:t xml:space="preserve">Стадия 1: аванс 50 % при подписании договора, 50 % по передаче материалов стадии</w:t>
       </w:r>
     </w:p>
     <w:p>

</xml_diff>

<commit_message>
Add the bureau's seal and signature to the proposal's sign-off
The signature block now carries the full contact set — entity, address, phone
and site — with the company seal and the director's signature over the
signature line, so the document reads as executed rather than as a blank to
be printed and signed.

Both graphics come from the bureau's own BI-EXPO proposal, converted to PNG
with the white ground made transparent so they overlay the rule and each
other the way a stamped page does. They are placed as floating objects
anchored to the signature paragraph.

Removing the two floatImg calls in kp.js returns a clean form for wet signing.

Co-Authored-By: Claude Opus 5 <noreply@anthropic.com>
Claude-Session: https://claude.ai/code/session_01Wn326a6Y6rDm3i5rqK96ac
</commit_message>
<xml_diff>
--- a/presentations/aurora-hotel/kp/MOST_KP_Bukhtarminskaya_EP.docx
+++ b/presentations/aurora-hotel/kp/MOST_KP_Bukhtarminskaya_EP.docx
@@ -3455,12 +3455,12 @@
     </w:p>
     <w:p>
       <w:pPr>
-        <w:spacing w:after="560"/>
-      </w:pPr>
-    </w:p>
-    <w:p>
-      <w:pPr>
-        <w:spacing w:after="60" w:before="0" w:line="260"/>
+        <w:spacing w:after="520"/>
+      </w:pPr>
+    </w:p>
+    <w:p>
+      <w:pPr>
+        <w:spacing w:after="40" w:before="0" w:line="260"/>
       </w:pPr>
       <w:r>
         <w:rPr>
@@ -3478,7 +3478,7 @@
     </w:p>
     <w:p>
       <w:pPr>
-        <w:spacing w:after="420" w:before="0" w:line="260"/>
+        <w:spacing w:after="20" w:before="0" w:line="260"/>
       </w:pPr>
       <w:r>
         <w:rPr>
@@ -3488,17 +3488,149 @@
           <w:i w:val="false"/>
           <w:iCs w:val="false"/>
           <w:color w:val="333333"/>
-          <w:sz w:val="17"/>
-          <w:szCs w:val="17"/>
+          <w:sz w:val="18"/>
+          <w:szCs w:val="18"/>
         </w:rPr>
         <w:t xml:space="preserve">г. Алматы, ул. Утеген батыра 11в к6/1</w:t>
       </w:r>
     </w:p>
     <w:p>
       <w:pPr>
+        <w:spacing w:after="20" w:before="0" w:line="260"/>
+      </w:pPr>
+      <w:r>
+        <w:rPr>
+          <w:rFonts w:ascii="Arial" w:cs="Arial" w:eastAsia="Arial" w:hAnsi="Arial"/>
+          <w:b w:val="false"/>
+          <w:bCs w:val="false"/>
+          <w:i w:val="false"/>
+          <w:iCs w:val="false"/>
+          <w:color w:val="333333"/>
+          <w:sz w:val="18"/>
+          <w:szCs w:val="18"/>
+        </w:rPr>
+        <w:t xml:space="preserve">+7 771 733 77 00</w:t>
+      </w:r>
+    </w:p>
+    <w:p>
+      <w:pPr>
+        <w:spacing w:after="560" w:before="0" w:line="260"/>
+      </w:pPr>
+      <w:r>
+        <w:rPr>
+          <w:rFonts w:ascii="Arial" w:cs="Arial" w:eastAsia="Arial" w:hAnsi="Arial"/>
+          <w:b w:val="false"/>
+          <w:bCs w:val="false"/>
+          <w:i w:val="false"/>
+          <w:iCs w:val="false"/>
+          <w:color w:val="333333"/>
+          <w:sz w:val="18"/>
+          <w:szCs w:val="18"/>
+        </w:rPr>
+        <w:t xml:space="preserve">most-a.com</w:t>
+      </w:r>
+    </w:p>
+    <w:p>
+      <w:pPr>
         <w:spacing w:after="0" w:line="260"/>
       </w:pPr>
       <w:r>
+        <w:drawing>
+          <wp:anchor distT="0" distB="0" distL="0" distR="0" simplePos="0" allowOverlap="1" behindDoc="0" locked="0" layoutInCell="1" relativeHeight="1085850">
+            <wp:simplePos x="0" y="0"/>
+            <wp:positionH relativeFrom="column">
+              <wp:posOffset>530352</wp:posOffset>
+            </wp:positionH>
+            <wp:positionV relativeFrom="paragraph">
+              <wp:posOffset>-274320</wp:posOffset>
+            </wp:positionV>
+            <wp:extent cx="1123950" cy="1085850"/>
+            <wp:effectExtent t="0" r="0" b="0" l="0"/>
+            <wp:wrapNone/>
+            <wp:docPr id="1" name="" descr="" title=""/>
+            <wp:cNvGraphicFramePr>
+              <a:graphicFrameLocks xmlns:a="http://schemas.openxmlformats.org/drawingml/2006/main" noChangeAspect="1"/>
+            </wp:cNvGraphicFramePr>
+            <a:graphic xmlns:a="http://schemas.openxmlformats.org/drawingml/2006/main">
+              <a:graphicData uri="http://schemas.openxmlformats.org/drawingml/2006/picture">
+                <pic:pic xmlns:pic="http://schemas.openxmlformats.org/drawingml/2006/picture">
+                  <pic:nvPicPr>
+                    <pic:cNvPr id="0" name="" descr=""/>
+                    <pic:cNvPicPr>
+                      <a:picLocks noChangeAspect="1" noChangeArrowheads="1"/>
+                    </pic:cNvPicPr>
+                  </pic:nvPicPr>
+                  <pic:blipFill>
+                    <a:blip r:embed="rId9" cstate="none"/>
+                    <a:srcRect/>
+                    <a:stretch>
+                      <a:fillRect/>
+                    </a:stretch>
+                  </pic:blipFill>
+                  <pic:spPr bwMode="auto">
+                    <a:xfrm>
+                      <a:off x="0" y="0"/>
+                      <a:ext cx="1123950" cy="1085850"/>
+                    </a:xfrm>
+                    <a:prstGeom prst="rect">
+                      <a:avLst/>
+                    </a:prstGeom>
+                  </pic:spPr>
+                </pic:pic>
+              </a:graphicData>
+            </a:graphic>
+          </wp:anchor>
+        </w:drawing>
+      </w:r>
+      <w:r>
+        <w:drawing>
+          <wp:anchor distT="0" distB="0" distL="0" distR="0" simplePos="0" allowOverlap="1" behindDoc="0" locked="0" layoutInCell="1" relativeHeight="981075">
+            <wp:simplePos x="0" y="0"/>
+            <wp:positionH relativeFrom="column">
+              <wp:posOffset>1188720</wp:posOffset>
+            </wp:positionH>
+            <wp:positionV relativeFrom="paragraph">
+              <wp:posOffset>-420624</wp:posOffset>
+            </wp:positionV>
+            <wp:extent cx="1600200" cy="981075"/>
+            <wp:effectExtent t="0" r="0" b="0" l="0"/>
+            <wp:wrapNone/>
+            <wp:docPr id="1" name="" descr="" title=""/>
+            <wp:cNvGraphicFramePr>
+              <a:graphicFrameLocks xmlns:a="http://schemas.openxmlformats.org/drawingml/2006/main" noChangeAspect="1"/>
+            </wp:cNvGraphicFramePr>
+            <a:graphic xmlns:a="http://schemas.openxmlformats.org/drawingml/2006/main">
+              <a:graphicData uri="http://schemas.openxmlformats.org/drawingml/2006/picture">
+                <pic:pic xmlns:pic="http://schemas.openxmlformats.org/drawingml/2006/picture">
+                  <pic:nvPicPr>
+                    <pic:cNvPr id="0" name="" descr=""/>
+                    <pic:cNvPicPr>
+                      <a:picLocks noChangeAspect="1" noChangeArrowheads="1"/>
+                    </pic:cNvPicPr>
+                  </pic:nvPicPr>
+                  <pic:blipFill>
+                    <a:blip r:embed="rId10" cstate="none"/>
+                    <a:srcRect/>
+                    <a:stretch>
+                      <a:fillRect/>
+                    </a:stretch>
+                  </pic:blipFill>
+                  <pic:spPr bwMode="auto">
+                    <a:xfrm>
+                      <a:off x="0" y="0"/>
+                      <a:ext cx="1600200" cy="981075"/>
+                    </a:xfrm>
+                    <a:prstGeom prst="rect">
+                      <a:avLst/>
+                    </a:prstGeom>
+                  </pic:spPr>
+                </pic:pic>
+              </a:graphicData>
+            </a:graphic>
+          </wp:anchor>
+        </w:drawing>
+      </w:r>
+      <w:r>
         <w:rPr>
           <w:rFonts w:ascii="Arial" w:cs="Arial" w:eastAsia="Arial" w:hAnsi="Arial"/>
           <w:b w:val="false"/>
@@ -3519,10 +3651,10 @@
           <w:i w:val="false"/>
           <w:iCs w:val="false"/>
           <w:color w:val="8A8A8A"/>
-          <w:sz w:val="17"/>
-          <w:szCs w:val="17"/>
-        </w:rPr>
-        <w:t xml:space="preserve">          М.П.  </w:t>
+          <w:sz w:val="20"/>
+          <w:szCs w:val="20"/>
+        </w:rPr>
+        <w:t xml:space="preserve">            </w:t>
       </w:r>
       <w:r>
         <w:rPr>

</xml_diff>

<commit_message>
Spread the visualisations across all three stages
All eleven views sat under the pre-concept, which left later stages with no
renders in scope: any re-render after the masterplan was revised fell outside
the offer. They now split 3 exterior views at pre-concept, 3 more including
the night shot at concept, and 5 interiors at schematic design — the same
eleven the deck carries.

Co-Authored-By: Claude Opus 5 <noreply@anthropic.com>
Claude-Session: https://claude.ai/code/session_01Wn326a6Y6rDm3i5rqK96ac
</commit_message>
<xml_diff>
--- a/presentations/aurora-hotel/kp/MOST_KP_Bukhtarminskaya_EP.docx
+++ b/presentations/aurora-hotel/kp/MOST_KP_Bukhtarminskaya_EP.docx
@@ -2102,7 +2102,7 @@
           <w:sz w:val="20"/>
           <w:szCs w:val="20"/>
         </w:rPr>
-        <w:t xml:space="preserve">Визуализации — 11 ракурсов (экстерьер, интерьеры общественных зон и номера)</w:t>
+        <w:t xml:space="preserve">Визуализации объёмного решения — 3 ракурса экстерьера</w:t>
       </w:r>
     </w:p>
     <w:p>
@@ -2349,6 +2349,38 @@
           <w:sz w:val="20"/>
           <w:szCs w:val="20"/>
         </w:rPr>
+        <w:t xml:space="preserve">Визуализации экстерьера — 3 ракурса, включая вечерний вид</w:t>
+      </w:r>
+    </w:p>
+    <w:p>
+      <w:pPr>
+        <w:spacing w:after="55" w:line="245"/>
+        <w:ind w:left="200" w:hanging="200"/>
+      </w:pPr>
+      <w:r>
+        <w:rPr>
+          <w:rFonts w:ascii="Arial" w:cs="Arial" w:eastAsia="Arial" w:hAnsi="Arial"/>
+          <w:b w:val="false"/>
+          <w:bCs w:val="false"/>
+          <w:i w:val="false"/>
+          <w:iCs w:val="false"/>
+          <w:color w:val="FF4D23"/>
+          <w:sz w:val="20"/>
+          <w:szCs w:val="20"/>
+        </w:rPr>
+        <w:t xml:space="preserve">— </w:t>
+      </w:r>
+      <w:r>
+        <w:rPr>
+          <w:rFonts w:ascii="Arial" w:cs="Arial" w:eastAsia="Arial" w:hAnsi="Arial"/>
+          <w:b w:val="false"/>
+          <w:bCs w:val="false"/>
+          <w:i w:val="false"/>
+          <w:iCs w:val="false"/>
+          <w:color w:val="333333"/>
+          <w:sz w:val="20"/>
+          <w:szCs w:val="20"/>
+        </w:rPr>
         <w:t xml:space="preserve">Уточнённые технико-экономические показатели, коэффициенты застройки и использования территории</w:t>
       </w:r>
     </w:p>
@@ -2533,6 +2565,38 @@
           <w:szCs w:val="20"/>
         </w:rPr>
         <w:t xml:space="preserve">Схема транспортного обслуживания, узлы въезда, пожарные проезды</w:t>
+      </w:r>
+    </w:p>
+    <w:p>
+      <w:pPr>
+        <w:spacing w:after="55" w:line="245"/>
+        <w:ind w:left="200" w:hanging="200"/>
+      </w:pPr>
+      <w:r>
+        <w:rPr>
+          <w:rFonts w:ascii="Arial" w:cs="Arial" w:eastAsia="Arial" w:hAnsi="Arial"/>
+          <w:b w:val="false"/>
+          <w:bCs w:val="false"/>
+          <w:i w:val="false"/>
+          <w:iCs w:val="false"/>
+          <w:color w:val="FF4D23"/>
+          <w:sz w:val="20"/>
+          <w:szCs w:val="20"/>
+        </w:rPr>
+        <w:t xml:space="preserve">— </w:t>
+      </w:r>
+      <w:r>
+        <w:rPr>
+          <w:rFonts w:ascii="Arial" w:cs="Arial" w:eastAsia="Arial" w:hAnsi="Arial"/>
+          <w:b w:val="false"/>
+          <w:bCs w:val="false"/>
+          <w:i w:val="false"/>
+          <w:iCs w:val="false"/>
+          <w:color w:val="333333"/>
+          <w:sz w:val="20"/>
+          <w:szCs w:val="20"/>
+        </w:rPr>
+        <w:t xml:space="preserve">Визуализации интерьеров — 5 ракурсов: общественные зоны и номер</w:t>
       </w:r>
     </w:p>
     <w:p>

</xml_diff>

<commit_message>
Scope visualisations by stage and rule interiors out
All eleven views sat under the pre-concept, leaving later stages with no
renders in scope, so any re-render after the masterplan was revised fell
outside the offer. Exterior views now split 3 at pre-concept and 3 at
concept, including the night shot.

Interiors are excluded outright rather than promised: the deck's interior
renders are illustrative, and interior design goes out under its own
proposal. Without that line the client would reasonably read the eight
interior views in the presentation as included work.

Co-Authored-By: Claude Opus 5 <noreply@anthropic.com>
Claude-Session: https://claude.ai/code/session_01Wn326a6Y6rDm3i5rqK96ac
</commit_message>
<xml_diff>
--- a/presentations/aurora-hotel/kp/MOST_KP_Bukhtarminskaya_EP.docx
+++ b/presentations/aurora-hotel/kp/MOST_KP_Bukhtarminskaya_EP.docx
@@ -2596,38 +2596,6 @@
           <w:sz w:val="20"/>
           <w:szCs w:val="20"/>
         </w:rPr>
-        <w:t xml:space="preserve">Визуализации интерьеров — 5 ракурсов: общественные зоны и номер</w:t>
-      </w:r>
-    </w:p>
-    <w:p>
-      <w:pPr>
-        <w:spacing w:after="55" w:line="245"/>
-        <w:ind w:left="200" w:hanging="200"/>
-      </w:pPr>
-      <w:r>
-        <w:rPr>
-          <w:rFonts w:ascii="Arial" w:cs="Arial" w:eastAsia="Arial" w:hAnsi="Arial"/>
-          <w:b w:val="false"/>
-          <w:bCs w:val="false"/>
-          <w:i w:val="false"/>
-          <w:iCs w:val="false"/>
-          <w:color w:val="FF4D23"/>
-          <w:sz w:val="20"/>
-          <w:szCs w:val="20"/>
-        </w:rPr>
-        <w:t xml:space="preserve">— </w:t>
-      </w:r>
-      <w:r>
-        <w:rPr>
-          <w:rFonts w:ascii="Arial" w:cs="Arial" w:eastAsia="Arial" w:hAnsi="Arial"/>
-          <w:b w:val="false"/>
-          <w:bCs w:val="false"/>
-          <w:i w:val="false"/>
-          <w:iCs w:val="false"/>
-          <w:color w:val="333333"/>
-          <w:sz w:val="20"/>
-          <w:szCs w:val="20"/>
-        </w:rPr>
         <w:t xml:space="preserve">Пояснительная записка</w:t>
       </w:r>
     </w:p>
@@ -3333,6 +3301,38 @@
           <w:szCs w:val="20"/>
         </w:rPr>
         <w:t xml:space="preserve">Инженерно-геологические и геодезические изыскания, топографическая съёмка</w:t>
+      </w:r>
+    </w:p>
+    <w:p>
+      <w:pPr>
+        <w:spacing w:after="55" w:line="245"/>
+        <w:ind w:left="200" w:hanging="200"/>
+      </w:pPr>
+      <w:r>
+        <w:rPr>
+          <w:rFonts w:ascii="Arial" w:cs="Arial" w:eastAsia="Arial" w:hAnsi="Arial"/>
+          <w:b w:val="false"/>
+          <w:bCs w:val="false"/>
+          <w:i w:val="false"/>
+          <w:iCs w:val="false"/>
+          <w:color w:val="FF4D23"/>
+          <w:sz w:val="20"/>
+          <w:szCs w:val="20"/>
+        </w:rPr>
+        <w:t xml:space="preserve">— </w:t>
+      </w:r>
+      <w:r>
+        <w:rPr>
+          <w:rFonts w:ascii="Arial" w:cs="Arial" w:eastAsia="Arial" w:hAnsi="Arial"/>
+          <w:b w:val="false"/>
+          <w:bCs w:val="false"/>
+          <w:i w:val="false"/>
+          <w:iCs w:val="false"/>
+          <w:color w:val="333333"/>
+          <w:sz w:val="20"/>
+          <w:szCs w:val="20"/>
+        </w:rPr>
+        <w:t xml:space="preserve">Дизайн-проект интерьеров. Интерьерные визуализации, передаваемые в составе презентационных материалов, носят иллюстративный характер и дизайн-проектом не являются</w:t>
       </w:r>
     </w:p>
     <w:p>

</xml_diff>